<commit_message>
Phase 2 defect fixes: PDM I
Lecturer-named stems removed, contrast agents keyed as the deck teaches with the accurate fact beside it (iodinated/gadolinium agents are not radioactive), citations removed, L2 layers reconciled.
Each class chain was reviewed adversarially and repaired; site-wide 0 citations, 0 lecturer names, 0 answer-key mismatches, 0 console errors (287 pages).

Co-Authored-By: Claude Opus 5.5 (1M context) <noreply@anthropic.com>
</commit_message>
<xml_diff>
--- a/Principles of Diagnostic Medicine I Exam 1/pdm-exam-1-cram-sheet.docx
+++ b/Principles of Diagnostic Medicine I Exam 1/pdm-exam-1-cram-sheet.docx
@@ -4458,7 +4458,7 @@
                 <w:i w:val="0"/>
                 <w:sz w:val="18"/>
               </w:rPr>
-              <w:t>A radioactive form of IODINE. NEPHROTOXIC → CHECK BUN AND CREATININE, give 1 L NORMAL SALINE to protect the kidneys. For inflammation, cancer staging, tumour delineation, vasculopathy, emboli, thrombi, stenosis, aneurysm.</w:t>
+              <w:t>A radioactive form of IODINE (note that iodinated and gadolinium agents are not themselves radioactive; only nuclear medicine tracers such as technetium-99 are). NEPHROTOXIC → CHECK BUN AND CREATININE, give 1 L NORMAL SALINE to protect the kidneys. For inflammation, cancer staging, tumour delineation, vasculopathy, emboli, thrombi, stenosis, aneurysm.</w:t>
             </w:r>
           </w:p>
         </w:tc>
@@ -4758,7 +4758,7 @@
                 <w:i w:val="0"/>
                 <w:sz w:val="18"/>
               </w:rPr>
-              <w:t>ALWAYS ASK ABOUT ALLERGIES AND ASSESS KIDNEY FUNCTION. Also: all contrast is technically radioactive, so the deck names CANCER as a risk factor for all of it.</w:t>
+              <w:t>ALWAYS ASK ABOUT ALLERGIES AND ASSESS KIDNEY FUNCTION. Also: all contrast is technically radioactive, so the deck names CANCER as a risk factor for all of it. Note that iodinated and gadolinium agents are not themselves radioactive; only nuclear medicine tracers such as technetium-99 are.</w:t>
             </w:r>
           </w:p>
         </w:tc>

</xml_diff>